<commit_message>
Version 1.3.1 - Articulos distribuidos
</commit_message>
<xml_diff>
--- a/Docs/Manual usuario gestor de etiquetas.docx
+++ b/Docs/Manual usuario gestor de etiquetas.docx
@@ -2,13 +2,1449 @@
 <file path=word/document.xml><?xml version="1.0" encoding="utf-8"?>
 <w:document xmlns:wpc="http://schemas.microsoft.com/office/word/2010/wordprocessingCanvas" xmlns:cx="http://schemas.microsoft.com/office/drawing/2014/chartex" xmlns:cx1="http://schemas.microsoft.com/office/drawing/2015/9/8/chartex" xmlns:cx2="http://schemas.microsoft.com/office/drawing/2015/10/21/chartex" xmlns:cx3="http://schemas.microsoft.com/office/drawing/2016/5/9/chartex" xmlns:cx4="http://schemas.microsoft.com/office/drawing/2016/5/10/chartex" xmlns:cx5="http://schemas.microsoft.com/office/drawing/2016/5/11/chartex" xmlns:cx6="http://schemas.microsoft.com/office/drawing/2016/5/12/chartex" xmlns:cx7="http://schemas.microsoft.com/office/drawing/2016/5/13/chartex" xmlns:cx8="http://schemas.microsoft.com/office/drawing/2016/5/14/chartex" xmlns:mc="http://schemas.openxmlformats.org/markup-compatibility/2006" xmlns:aink="http://schemas.microsoft.com/office/drawing/2016/ink" xmlns:am3d="http://schemas.microsoft.com/office/drawing/2017/model3d" xmlns:o="urn:schemas-microsoft-com:office:office" xmlns:oel="http://schemas.microsoft.com/office/2019/extlst" xmlns:r="http://schemas.openxmlformats.org/officeDocument/2006/relationships" xmlns:m="http://schemas.openxmlformats.org/officeDocument/2006/math" xmlns:v="urn:schemas-microsoft-com:vml" xmlns:wp14="http://schemas.microsoft.com/office/word/2010/wordprocessingDrawing" xmlns:wp="http://schemas.openxmlformats.org/drawingml/2006/wordprocessingDrawing" xmlns:w10="urn:schemas-microsoft-com:office:word" xmlns:w="http://schemas.openxmlformats.org/wordprocessingml/2006/main" xmlns:w14="http://schemas.microsoft.com/office/word/2010/wordml" xmlns:w15="http://schemas.microsoft.com/office/word/2012/wordml" xmlns:w16cex="http://schemas.microsoft.com/office/word/2018/wordml/cex" xmlns:w16cid="http://schemas.microsoft.com/office/word/2016/wordml/cid" xmlns:w16="http://schemas.microsoft.com/office/word/2018/wordml" xmlns:w16du="http://schemas.microsoft.com/office/word/2023/wordml/word16du" xmlns:w16sdtdh="http://schemas.microsoft.com/office/word/2020/wordml/sdtdatahash" xmlns:w16sdtfl="http://schemas.microsoft.com/office/word/2024/wordml/sdtformatlock" xmlns:w16se="http://schemas.microsoft.com/office/word/2015/wordml/symex" xmlns:wpg="http://schemas.microsoft.com/office/word/2010/wordprocessingGroup" xmlns:wpi="http://schemas.microsoft.com/office/word/2010/wordprocessingInk" xmlns:wne="http://schemas.microsoft.com/office/word/2006/wordml" xmlns:wps="http://schemas.microsoft.com/office/word/2010/wordprocessingShape" mc:Ignorable="w14 w15 w16se w16cid w16 w16cex w16sdtdh w16sdtfl w16du wp14">
   <w:body>
+    <w:sdt>
+      <w:sdtPr>
+        <w:id w:val="-138501837"/>
+        <w:docPartObj>
+          <w:docPartGallery w:val="Table of Contents"/>
+          <w:docPartUnique/>
+        </w:docPartObj>
+      </w:sdtPr>
+      <w:sdtEndPr>
+        <w:rPr>
+          <w:rFonts w:asciiTheme="minorHAnsi" w:eastAsiaTheme="minorHAnsi" w:hAnsiTheme="minorHAnsi" w:cstheme="minorBidi"/>
+          <w:b/>
+          <w:bCs/>
+          <w:color w:val="auto"/>
+          <w:sz w:val="28"/>
+          <w:szCs w:val="28"/>
+          <w:lang w:eastAsia="en-US"/>
+        </w:rPr>
+      </w:sdtEndPr>
+      <w:sdtContent>
+        <w:p>
+          <w:pPr>
+            <w:pStyle w:val="TtuloTDC"/>
+          </w:pPr>
+          <w:r>
+            <w:t>Contenido</w:t>
+          </w:r>
+        </w:p>
+        <w:p>
+          <w:pPr>
+            <w:pStyle w:val="TDC1"/>
+            <w:tabs>
+              <w:tab w:val="right" w:leader="dot" w:pos="9629"/>
+            </w:tabs>
+            <w:rPr>
+              <w:noProof/>
+            </w:rPr>
+          </w:pPr>
+          <w:r>
+            <w:fldChar w:fldCharType="begin"/>
+          </w:r>
+          <w:r>
+            <w:instrText xml:space="preserve"> TOC \o "1-3" \h \z \u </w:instrText>
+          </w:r>
+          <w:r>
+            <w:fldChar w:fldCharType="separate"/>
+          </w:r>
+          <w:hyperlink w:anchor="_Toc242960858" w:history="1">
+            <w:r>
+              <w:rPr>
+                <w:rStyle w:val="Hipervnculo"/>
+                <w:noProof/>
+              </w:rPr>
+              <w:t>FUNCIONALIDAD DEL MÓDULO</w:t>
+            </w:r>
+            <w:r>
+              <w:rPr>
+                <w:noProof/>
+                <w:webHidden/>
+              </w:rPr>
+              <w:tab/>
+            </w:r>
+            <w:r>
+              <w:rPr>
+                <w:noProof/>
+                <w:webHidden/>
+              </w:rPr>
+              <w:fldChar w:fldCharType="begin"/>
+            </w:r>
+            <w:r>
+              <w:rPr>
+                <w:noProof/>
+                <w:webHidden/>
+              </w:rPr>
+              <w:instrText xml:space="preserve"> PAGEREF _Toc242960858 \h </w:instrText>
+            </w:r>
+            <w:r>
+              <w:rPr>
+                <w:noProof/>
+                <w:webHidden/>
+              </w:rPr>
+            </w:r>
+            <w:r>
+              <w:rPr>
+                <w:noProof/>
+                <w:webHidden/>
+              </w:rPr>
+              <w:fldChar w:fldCharType="separate"/>
+            </w:r>
+            <w:r>
+              <w:rPr>
+                <w:noProof/>
+                <w:webHidden/>
+              </w:rPr>
+              <w:t>1</w:t>
+            </w:r>
+            <w:r>
+              <w:rPr>
+                <w:noProof/>
+                <w:webHidden/>
+              </w:rPr>
+              <w:fldChar w:fldCharType="end"/>
+            </w:r>
+          </w:hyperlink>
+        </w:p>
+        <w:p>
+          <w:pPr>
+            <w:pStyle w:val="TDC1"/>
+            <w:tabs>
+              <w:tab w:val="right" w:leader="dot" w:pos="9629"/>
+            </w:tabs>
+            <w:rPr>
+              <w:noProof/>
+            </w:rPr>
+          </w:pPr>
+          <w:hyperlink w:anchor="_Toc242960859" w:history="1">
+            <w:r>
+              <w:rPr>
+                <w:rStyle w:val="Hipervnculo"/>
+                <w:noProof/>
+              </w:rPr>
+              <w:t>ARCHIVOS REQUERIDOS DEL MÓDULO</w:t>
+            </w:r>
+            <w:r>
+              <w:rPr>
+                <w:noProof/>
+                <w:webHidden/>
+              </w:rPr>
+              <w:tab/>
+            </w:r>
+            <w:r>
+              <w:rPr>
+                <w:noProof/>
+                <w:webHidden/>
+              </w:rPr>
+              <w:fldChar w:fldCharType="begin"/>
+            </w:r>
+            <w:r>
+              <w:rPr>
+                <w:noProof/>
+                <w:webHidden/>
+              </w:rPr>
+              <w:instrText xml:space="preserve"> PAGEREF _Toc242960859 \h </w:instrText>
+            </w:r>
+            <w:r>
+              <w:rPr>
+                <w:noProof/>
+                <w:webHidden/>
+              </w:rPr>
+            </w:r>
+            <w:r>
+              <w:rPr>
+                <w:noProof/>
+                <w:webHidden/>
+              </w:rPr>
+              <w:fldChar w:fldCharType="separate"/>
+            </w:r>
+            <w:r>
+              <w:rPr>
+                <w:noProof/>
+                <w:webHidden/>
+              </w:rPr>
+              <w:t>1</w:t>
+            </w:r>
+            <w:r>
+              <w:rPr>
+                <w:noProof/>
+                <w:webHidden/>
+              </w:rPr>
+              <w:fldChar w:fldCharType="end"/>
+            </w:r>
+          </w:hyperlink>
+        </w:p>
+        <w:p>
+          <w:pPr>
+            <w:pStyle w:val="TDC1"/>
+            <w:tabs>
+              <w:tab w:val="right" w:leader="dot" w:pos="9629"/>
+            </w:tabs>
+            <w:rPr>
+              <w:noProof/>
+            </w:rPr>
+          </w:pPr>
+          <w:hyperlink w:anchor="_Toc242960860" w:history="1">
+            <w:r>
+              <w:rPr>
+                <w:rStyle w:val="Hipervnculo"/>
+                <w:noProof/>
+              </w:rPr>
+              <w:t>CONFIGURACION</w:t>
+            </w:r>
+            <w:r>
+              <w:rPr>
+                <w:noProof/>
+                <w:webHidden/>
+              </w:rPr>
+              <w:tab/>
+            </w:r>
+            <w:r>
+              <w:rPr>
+                <w:noProof/>
+                <w:webHidden/>
+              </w:rPr>
+              <w:fldChar w:fldCharType="begin"/>
+            </w:r>
+            <w:r>
+              <w:rPr>
+                <w:noProof/>
+                <w:webHidden/>
+              </w:rPr>
+              <w:instrText xml:space="preserve"> PAGEREF _Toc242960860 \h </w:instrText>
+            </w:r>
+            <w:r>
+              <w:rPr>
+                <w:noProof/>
+                <w:webHidden/>
+              </w:rPr>
+            </w:r>
+            <w:r>
+              <w:rPr>
+                <w:noProof/>
+                <w:webHidden/>
+              </w:rPr>
+              <w:fldChar w:fldCharType="separate"/>
+            </w:r>
+            <w:r>
+              <w:rPr>
+                <w:noProof/>
+                <w:webHidden/>
+              </w:rPr>
+              <w:t>1</w:t>
+            </w:r>
+            <w:r>
+              <w:rPr>
+                <w:noProof/>
+                <w:webHidden/>
+              </w:rPr>
+              <w:fldChar w:fldCharType="end"/>
+            </w:r>
+          </w:hyperlink>
+        </w:p>
+        <w:p>
+          <w:pPr>
+            <w:pStyle w:val="TDC1"/>
+            <w:tabs>
+              <w:tab w:val="right" w:leader="dot" w:pos="9629"/>
+            </w:tabs>
+            <w:rPr>
+              <w:noProof/>
+            </w:rPr>
+          </w:pPr>
+          <w:hyperlink w:anchor="_Toc242960861" w:history="1">
+            <w:r>
+              <w:rPr>
+                <w:rStyle w:val="Hipervnculo"/>
+                <w:noProof/>
+              </w:rPr>
+              <w:t>CONFIGURACION DE LA BÁSCULA</w:t>
+            </w:r>
+            <w:r>
+              <w:rPr>
+                <w:noProof/>
+                <w:webHidden/>
+              </w:rPr>
+              <w:tab/>
+            </w:r>
+            <w:r>
+              <w:rPr>
+                <w:noProof/>
+                <w:webHidden/>
+              </w:rPr>
+              <w:fldChar w:fldCharType="begin"/>
+            </w:r>
+            <w:r>
+              <w:rPr>
+                <w:noProof/>
+                <w:webHidden/>
+              </w:rPr>
+              <w:instrText xml:space="preserve"> PAGEREF _Toc242960861 \h </w:instrText>
+            </w:r>
+            <w:r>
+              <w:rPr>
+                <w:noProof/>
+                <w:webHidden/>
+              </w:rPr>
+            </w:r>
+            <w:r>
+              <w:rPr>
+                <w:noProof/>
+                <w:webHidden/>
+              </w:rPr>
+              <w:fldChar w:fldCharType="separate"/>
+            </w:r>
+            <w:r>
+              <w:rPr>
+                <w:noProof/>
+                <w:webHidden/>
+              </w:rPr>
+              <w:t>4</w:t>
+            </w:r>
+            <w:r>
+              <w:rPr>
+                <w:noProof/>
+                <w:webHidden/>
+              </w:rPr>
+              <w:fldChar w:fldCharType="end"/>
+            </w:r>
+          </w:hyperlink>
+        </w:p>
+        <w:p>
+          <w:pPr>
+            <w:pStyle w:val="TDC1"/>
+            <w:tabs>
+              <w:tab w:val="right" w:leader="dot" w:pos="9629"/>
+            </w:tabs>
+            <w:rPr>
+              <w:noProof/>
+            </w:rPr>
+          </w:pPr>
+          <w:hyperlink w:anchor="_Toc242960862" w:history="1">
+            <w:r>
+              <w:rPr>
+                <w:rStyle w:val="Hipervnculo"/>
+                <w:noProof/>
+              </w:rPr>
+              <w:t>FUNCIONAMIENTO DE LA APLICACIÓN</w:t>
+            </w:r>
+            <w:r>
+              <w:rPr>
+                <w:noProof/>
+                <w:webHidden/>
+              </w:rPr>
+              <w:tab/>
+            </w:r>
+            <w:r>
+              <w:rPr>
+                <w:noProof/>
+                <w:webHidden/>
+              </w:rPr>
+              <w:fldChar w:fldCharType="begin"/>
+            </w:r>
+            <w:r>
+              <w:rPr>
+                <w:noProof/>
+                <w:webHidden/>
+              </w:rPr>
+              <w:instrText xml:space="preserve"> PAGEREF _Toc242960862 \h </w:instrText>
+            </w:r>
+            <w:r>
+              <w:rPr>
+                <w:noProof/>
+                <w:webHidden/>
+              </w:rPr>
+            </w:r>
+            <w:r>
+              <w:rPr>
+                <w:noProof/>
+                <w:webHidden/>
+              </w:rPr>
+              <w:fldChar w:fldCharType="separate"/>
+            </w:r>
+            <w:r>
+              <w:rPr>
+                <w:noProof/>
+                <w:webHidden/>
+              </w:rPr>
+              <w:t>5</w:t>
+            </w:r>
+            <w:r>
+              <w:rPr>
+                <w:noProof/>
+                <w:webHidden/>
+              </w:rPr>
+              <w:fldChar w:fldCharType="end"/>
+            </w:r>
+          </w:hyperlink>
+        </w:p>
+        <w:p>
+          <w:pPr>
+            <w:pStyle w:val="TDC2"/>
+            <w:tabs>
+              <w:tab w:val="right" w:leader="dot" w:pos="9629"/>
+            </w:tabs>
+            <w:rPr>
+              <w:noProof/>
+            </w:rPr>
+          </w:pPr>
+          <w:hyperlink w:anchor="_Toc242960863" w:history="1">
+            <w:r>
+              <w:rPr>
+                <w:rStyle w:val="Hipervnculo"/>
+                <w:noProof/>
+              </w:rPr>
+              <w:t>Trabajo en A3erp</w:t>
+            </w:r>
+            <w:r>
+              <w:rPr>
+                <w:noProof/>
+                <w:webHidden/>
+              </w:rPr>
+              <w:tab/>
+            </w:r>
+            <w:r>
+              <w:rPr>
+                <w:noProof/>
+                <w:webHidden/>
+              </w:rPr>
+              <w:fldChar w:fldCharType="begin"/>
+            </w:r>
+            <w:r>
+              <w:rPr>
+                <w:noProof/>
+                <w:webHidden/>
+              </w:rPr>
+              <w:instrText xml:space="preserve"> PAGEREF _Toc242960863 \h </w:instrText>
+            </w:r>
+            <w:r>
+              <w:rPr>
+                <w:noProof/>
+                <w:webHidden/>
+              </w:rPr>
+            </w:r>
+            <w:r>
+              <w:rPr>
+                <w:noProof/>
+                <w:webHidden/>
+              </w:rPr>
+              <w:fldChar w:fldCharType="separate"/>
+            </w:r>
+            <w:r>
+              <w:rPr>
+                <w:noProof/>
+                <w:webHidden/>
+              </w:rPr>
+              <w:t>5</w:t>
+            </w:r>
+            <w:r>
+              <w:rPr>
+                <w:noProof/>
+                <w:webHidden/>
+              </w:rPr>
+              <w:fldChar w:fldCharType="end"/>
+            </w:r>
+          </w:hyperlink>
+        </w:p>
+        <w:p>
+          <w:pPr>
+            <w:pStyle w:val="TDC2"/>
+            <w:tabs>
+              <w:tab w:val="right" w:leader="dot" w:pos="9629"/>
+            </w:tabs>
+            <w:rPr>
+              <w:noProof/>
+            </w:rPr>
+          </w:pPr>
+          <w:hyperlink w:anchor="_Toc242960864" w:history="1">
+            <w:r>
+              <w:rPr>
+                <w:rStyle w:val="Hipervnculo"/>
+                <w:noProof/>
+              </w:rPr>
+              <w:t>Alta de los usuarios del módulo</w:t>
+            </w:r>
+            <w:r>
+              <w:rPr>
+                <w:noProof/>
+                <w:webHidden/>
+              </w:rPr>
+              <w:tab/>
+            </w:r>
+            <w:r>
+              <w:rPr>
+                <w:noProof/>
+                <w:webHidden/>
+              </w:rPr>
+              <w:fldChar w:fldCharType="begin"/>
+            </w:r>
+            <w:r>
+              <w:rPr>
+                <w:noProof/>
+                <w:webHidden/>
+              </w:rPr>
+              <w:instrText xml:space="preserve"> PAGEREF _Toc242960864 \h </w:instrText>
+            </w:r>
+            <w:r>
+              <w:rPr>
+                <w:noProof/>
+                <w:webHidden/>
+              </w:rPr>
+            </w:r>
+            <w:r>
+              <w:rPr>
+                <w:noProof/>
+                <w:webHidden/>
+              </w:rPr>
+              <w:fldChar w:fldCharType="separate"/>
+            </w:r>
+            <w:r>
+              <w:rPr>
+                <w:noProof/>
+                <w:webHidden/>
+              </w:rPr>
+              <w:t>6</w:t>
+            </w:r>
+            <w:r>
+              <w:rPr>
+                <w:noProof/>
+                <w:webHidden/>
+              </w:rPr>
+              <w:fldChar w:fldCharType="end"/>
+            </w:r>
+          </w:hyperlink>
+        </w:p>
+        <w:p>
+          <w:pPr>
+            <w:pStyle w:val="TDC2"/>
+            <w:tabs>
+              <w:tab w:val="right" w:leader="dot" w:pos="9629"/>
+            </w:tabs>
+            <w:rPr>
+              <w:noProof/>
+            </w:rPr>
+          </w:pPr>
+          <w:hyperlink w:anchor="_Toc242960865" w:history="1">
+            <w:r>
+              <w:rPr>
+                <w:rStyle w:val="Hipervnculo"/>
+                <w:noProof/>
+              </w:rPr>
+              <w:t>Alta de basculas</w:t>
+            </w:r>
+            <w:r>
+              <w:rPr>
+                <w:noProof/>
+                <w:webHidden/>
+              </w:rPr>
+              <w:tab/>
+            </w:r>
+            <w:r>
+              <w:rPr>
+                <w:noProof/>
+                <w:webHidden/>
+              </w:rPr>
+              <w:fldChar w:fldCharType="begin"/>
+            </w:r>
+            <w:r>
+              <w:rPr>
+                <w:noProof/>
+                <w:webHidden/>
+              </w:rPr>
+              <w:instrText xml:space="preserve"> PAGEREF _Toc242960865 \h </w:instrText>
+            </w:r>
+            <w:r>
+              <w:rPr>
+                <w:noProof/>
+                <w:webHidden/>
+              </w:rPr>
+            </w:r>
+            <w:r>
+              <w:rPr>
+                <w:noProof/>
+                <w:webHidden/>
+              </w:rPr>
+              <w:fldChar w:fldCharType="separate"/>
+            </w:r>
+            <w:r>
+              <w:rPr>
+                <w:noProof/>
+                <w:webHidden/>
+              </w:rPr>
+              <w:t>7</w:t>
+            </w:r>
+            <w:r>
+              <w:rPr>
+                <w:noProof/>
+                <w:webHidden/>
+              </w:rPr>
+              <w:fldChar w:fldCharType="end"/>
+            </w:r>
+          </w:hyperlink>
+        </w:p>
+        <w:p>
+          <w:pPr>
+            <w:pStyle w:val="TDC2"/>
+            <w:tabs>
+              <w:tab w:val="right" w:leader="dot" w:pos="9629"/>
+            </w:tabs>
+            <w:rPr>
+              <w:noProof/>
+            </w:rPr>
+          </w:pPr>
+          <w:hyperlink w:anchor="_Toc242960866" w:history="1">
+            <w:r>
+              <w:rPr>
+                <w:rStyle w:val="Hipervnculo"/>
+                <w:noProof/>
+              </w:rPr>
+              <w:t>Alta de tipos de articulo</w:t>
+            </w:r>
+            <w:r>
+              <w:rPr>
+                <w:noProof/>
+                <w:webHidden/>
+              </w:rPr>
+              <w:tab/>
+            </w:r>
+            <w:r>
+              <w:rPr>
+                <w:noProof/>
+                <w:webHidden/>
+              </w:rPr>
+              <w:fldChar w:fldCharType="begin"/>
+            </w:r>
+            <w:r>
+              <w:rPr>
+                <w:noProof/>
+                <w:webHidden/>
+              </w:rPr>
+              <w:instrText xml:space="preserve"> PAGEREF _Toc242960866 \h </w:instrText>
+            </w:r>
+            <w:r>
+              <w:rPr>
+                <w:noProof/>
+                <w:webHidden/>
+              </w:rPr>
+            </w:r>
+            <w:r>
+              <w:rPr>
+                <w:noProof/>
+                <w:webHidden/>
+              </w:rPr>
+              <w:fldChar w:fldCharType="separate"/>
+            </w:r>
+            <w:r>
+              <w:rPr>
+                <w:noProof/>
+                <w:webHidden/>
+              </w:rPr>
+              <w:t>7</w:t>
+            </w:r>
+            <w:r>
+              <w:rPr>
+                <w:noProof/>
+                <w:webHidden/>
+              </w:rPr>
+              <w:fldChar w:fldCharType="end"/>
+            </w:r>
+          </w:hyperlink>
+        </w:p>
+        <w:p>
+          <w:pPr>
+            <w:pStyle w:val="TDC2"/>
+            <w:tabs>
+              <w:tab w:val="right" w:leader="dot" w:pos="9629"/>
+            </w:tabs>
+            <w:rPr>
+              <w:noProof/>
+            </w:rPr>
+          </w:pPr>
+          <w:hyperlink w:anchor="_Toc242960867" w:history="1">
+            <w:r>
+              <w:rPr>
+                <w:rStyle w:val="Hipervnculo"/>
+                <w:noProof/>
+              </w:rPr>
+              <w:t>Configuración de etiquetas</w:t>
+            </w:r>
+            <w:r>
+              <w:rPr>
+                <w:noProof/>
+                <w:webHidden/>
+              </w:rPr>
+              <w:tab/>
+            </w:r>
+            <w:r>
+              <w:rPr>
+                <w:noProof/>
+                <w:webHidden/>
+              </w:rPr>
+              <w:fldChar w:fldCharType="begin"/>
+            </w:r>
+            <w:r>
+              <w:rPr>
+                <w:noProof/>
+                <w:webHidden/>
+              </w:rPr>
+              <w:instrText xml:space="preserve"> PAGEREF _Toc242960867 \h </w:instrText>
+            </w:r>
+            <w:r>
+              <w:rPr>
+                <w:noProof/>
+                <w:webHidden/>
+              </w:rPr>
+            </w:r>
+            <w:r>
+              <w:rPr>
+                <w:noProof/>
+                <w:webHidden/>
+              </w:rPr>
+              <w:fldChar w:fldCharType="separate"/>
+            </w:r>
+            <w:r>
+              <w:rPr>
+                <w:noProof/>
+                <w:webHidden/>
+              </w:rPr>
+              <w:t>8</w:t>
+            </w:r>
+            <w:r>
+              <w:rPr>
+                <w:noProof/>
+                <w:webHidden/>
+              </w:rPr>
+              <w:fldChar w:fldCharType="end"/>
+            </w:r>
+          </w:hyperlink>
+        </w:p>
+        <w:p>
+          <w:pPr>
+            <w:pStyle w:val="TDC2"/>
+            <w:tabs>
+              <w:tab w:val="right" w:leader="dot" w:pos="9629"/>
+            </w:tabs>
+            <w:rPr>
+              <w:noProof/>
+            </w:rPr>
+          </w:pPr>
+          <w:hyperlink w:anchor="_Toc242960868" w:history="1">
+            <w:r>
+              <w:rPr>
+                <w:rStyle w:val="Hipervnculo"/>
+                <w:noProof/>
+              </w:rPr>
+              <w:t>Datos de los artículos para las etiquetas</w:t>
+            </w:r>
+            <w:r>
+              <w:rPr>
+                <w:noProof/>
+                <w:webHidden/>
+              </w:rPr>
+              <w:tab/>
+            </w:r>
+            <w:r>
+              <w:rPr>
+                <w:noProof/>
+                <w:webHidden/>
+              </w:rPr>
+              <w:fldChar w:fldCharType="begin"/>
+            </w:r>
+            <w:r>
+              <w:rPr>
+                <w:noProof/>
+                <w:webHidden/>
+              </w:rPr>
+              <w:instrText xml:space="preserve"> PAGEREF _Toc242960868 \h </w:instrText>
+            </w:r>
+            <w:r>
+              <w:rPr>
+                <w:noProof/>
+                <w:webHidden/>
+              </w:rPr>
+            </w:r>
+            <w:r>
+              <w:rPr>
+                <w:noProof/>
+                <w:webHidden/>
+              </w:rPr>
+              <w:fldChar w:fldCharType="separate"/>
+            </w:r>
+            <w:r>
+              <w:rPr>
+                <w:noProof/>
+                <w:webHidden/>
+              </w:rPr>
+              <w:t>9</w:t>
+            </w:r>
+            <w:r>
+              <w:rPr>
+                <w:noProof/>
+                <w:webHidden/>
+              </w:rPr>
+              <w:fldChar w:fldCharType="end"/>
+            </w:r>
+          </w:hyperlink>
+        </w:p>
+        <w:p>
+          <w:pPr>
+            <w:pStyle w:val="TDC2"/>
+            <w:tabs>
+              <w:tab w:val="right" w:leader="dot" w:pos="9629"/>
+            </w:tabs>
+            <w:rPr>
+              <w:noProof/>
+            </w:rPr>
+          </w:pPr>
+          <w:hyperlink w:anchor="_Toc242960869" w:history="1">
+            <w:r>
+              <w:rPr>
+                <w:rStyle w:val="Hipervnculo"/>
+                <w:noProof/>
+              </w:rPr>
+              <w:t>Trabajo en el módulo</w:t>
+            </w:r>
+            <w:r>
+              <w:rPr>
+                <w:noProof/>
+                <w:webHidden/>
+              </w:rPr>
+              <w:tab/>
+            </w:r>
+            <w:r>
+              <w:rPr>
+                <w:noProof/>
+                <w:webHidden/>
+              </w:rPr>
+              <w:fldChar w:fldCharType="begin"/>
+            </w:r>
+            <w:r>
+              <w:rPr>
+                <w:noProof/>
+                <w:webHidden/>
+              </w:rPr>
+              <w:instrText xml:space="preserve"> PAGEREF _Toc242960869 \h </w:instrText>
+            </w:r>
+            <w:r>
+              <w:rPr>
+                <w:noProof/>
+                <w:webHidden/>
+              </w:rPr>
+            </w:r>
+            <w:r>
+              <w:rPr>
+                <w:noProof/>
+                <w:webHidden/>
+              </w:rPr>
+              <w:fldChar w:fldCharType="separate"/>
+            </w:r>
+            <w:r>
+              <w:rPr>
+                <w:noProof/>
+                <w:webHidden/>
+              </w:rPr>
+              <w:t>9</w:t>
+            </w:r>
+            <w:r>
+              <w:rPr>
+                <w:noProof/>
+                <w:webHidden/>
+              </w:rPr>
+              <w:fldChar w:fldCharType="end"/>
+            </w:r>
+          </w:hyperlink>
+        </w:p>
+        <w:p>
+          <w:pPr>
+            <w:pStyle w:val="TDC2"/>
+            <w:tabs>
+              <w:tab w:val="right" w:leader="dot" w:pos="9629"/>
+            </w:tabs>
+            <w:rPr>
+              <w:noProof/>
+            </w:rPr>
+          </w:pPr>
+          <w:hyperlink w:anchor="_Toc242960870" w:history="1">
+            <w:r>
+              <w:rPr>
+                <w:rStyle w:val="Hipervnculo"/>
+                <w:noProof/>
+              </w:rPr>
+              <w:t>Pesadas de producto</w:t>
+            </w:r>
+            <w:r>
+              <w:rPr>
+                <w:noProof/>
+                <w:webHidden/>
+              </w:rPr>
+              <w:tab/>
+            </w:r>
+            <w:r>
+              <w:rPr>
+                <w:noProof/>
+                <w:webHidden/>
+              </w:rPr>
+              <w:fldChar w:fldCharType="begin"/>
+            </w:r>
+            <w:r>
+              <w:rPr>
+                <w:noProof/>
+                <w:webHidden/>
+              </w:rPr>
+              <w:instrText xml:space="preserve"> PAGEREF _Toc242960870 \h </w:instrText>
+            </w:r>
+            <w:r>
+              <w:rPr>
+                <w:noProof/>
+                <w:webHidden/>
+              </w:rPr>
+            </w:r>
+            <w:r>
+              <w:rPr>
+                <w:noProof/>
+                <w:webHidden/>
+              </w:rPr>
+              <w:fldChar w:fldCharType="separate"/>
+            </w:r>
+            <w:r>
+              <w:rPr>
+                <w:noProof/>
+                <w:webHidden/>
+              </w:rPr>
+              <w:t>12</w:t>
+            </w:r>
+            <w:r>
+              <w:rPr>
+                <w:noProof/>
+                <w:webHidden/>
+              </w:rPr>
+              <w:fldChar w:fldCharType="end"/>
+            </w:r>
+          </w:hyperlink>
+        </w:p>
+        <w:p>
+          <w:pPr>
+            <w:pStyle w:val="TDC2"/>
+            <w:tabs>
+              <w:tab w:val="right" w:leader="dot" w:pos="9629"/>
+            </w:tabs>
+            <w:rPr>
+              <w:noProof/>
+            </w:rPr>
+          </w:pPr>
+          <w:hyperlink w:anchor="_Toc242960871" w:history="1">
+            <w:r>
+              <w:rPr>
+                <w:rStyle w:val="Hipervnculo"/>
+                <w:noProof/>
+              </w:rPr>
+              <w:t>Inserción manual de pesadas</w:t>
+            </w:r>
+            <w:r>
+              <w:rPr>
+                <w:noProof/>
+                <w:webHidden/>
+              </w:rPr>
+              <w:tab/>
+            </w:r>
+            <w:r>
+              <w:rPr>
+                <w:noProof/>
+                <w:webHidden/>
+              </w:rPr>
+              <w:fldChar w:fldCharType="begin"/>
+            </w:r>
+            <w:r>
+              <w:rPr>
+                <w:noProof/>
+                <w:webHidden/>
+              </w:rPr>
+              <w:instrText xml:space="preserve"> PAGEREF _Toc242960871 \h </w:instrText>
+            </w:r>
+            <w:r>
+              <w:rPr>
+                <w:noProof/>
+                <w:webHidden/>
+              </w:rPr>
+            </w:r>
+            <w:r>
+              <w:rPr>
+                <w:noProof/>
+                <w:webHidden/>
+              </w:rPr>
+              <w:fldChar w:fldCharType="separate"/>
+            </w:r>
+            <w:r>
+              <w:rPr>
+                <w:noProof/>
+                <w:webHidden/>
+              </w:rPr>
+              <w:t>12</w:t>
+            </w:r>
+            <w:r>
+              <w:rPr>
+                <w:noProof/>
+                <w:webHidden/>
+              </w:rPr>
+              <w:fldChar w:fldCharType="end"/>
+            </w:r>
+          </w:hyperlink>
+        </w:p>
+        <w:p>
+          <w:pPr>
+            <w:pStyle w:val="TDC2"/>
+            <w:tabs>
+              <w:tab w:val="right" w:leader="dot" w:pos="9629"/>
+            </w:tabs>
+            <w:rPr>
+              <w:noProof/>
+            </w:rPr>
+          </w:pPr>
+          <w:hyperlink w:anchor="_Toc242960872" w:history="1">
+            <w:r>
+              <w:rPr>
+                <w:rStyle w:val="Hipervnculo"/>
+                <w:noProof/>
+              </w:rPr>
+              <w:t>Eliminación de pesadas</w:t>
+            </w:r>
+            <w:r>
+              <w:rPr>
+                <w:noProof/>
+                <w:webHidden/>
+              </w:rPr>
+              <w:tab/>
+            </w:r>
+            <w:r>
+              <w:rPr>
+                <w:noProof/>
+                <w:webHidden/>
+              </w:rPr>
+              <w:fldChar w:fldCharType="begin"/>
+            </w:r>
+            <w:r>
+              <w:rPr>
+                <w:noProof/>
+                <w:webHidden/>
+              </w:rPr>
+              <w:instrText xml:space="preserve"> PAGEREF _Toc242960872 \h </w:instrText>
+            </w:r>
+            <w:r>
+              <w:rPr>
+                <w:noProof/>
+                <w:webHidden/>
+              </w:rPr>
+            </w:r>
+            <w:r>
+              <w:rPr>
+                <w:noProof/>
+                <w:webHidden/>
+              </w:rPr>
+              <w:fldChar w:fldCharType="separate"/>
+            </w:r>
+            <w:r>
+              <w:rPr>
+                <w:noProof/>
+                <w:webHidden/>
+              </w:rPr>
+              <w:t>13</w:t>
+            </w:r>
+            <w:r>
+              <w:rPr>
+                <w:noProof/>
+                <w:webHidden/>
+              </w:rPr>
+              <w:fldChar w:fldCharType="end"/>
+            </w:r>
+          </w:hyperlink>
+        </w:p>
+        <w:p>
+          <w:pPr>
+            <w:pStyle w:val="TDC2"/>
+            <w:tabs>
+              <w:tab w:val="right" w:leader="dot" w:pos="9629"/>
+            </w:tabs>
+            <w:rPr>
+              <w:noProof/>
+            </w:rPr>
+          </w:pPr>
+          <w:hyperlink w:anchor="_Toc242960873" w:history="1">
+            <w:r>
+              <w:rPr>
+                <w:rStyle w:val="Hipervnculo"/>
+                <w:noProof/>
+              </w:rPr>
+              <w:t>Impresión manual de etiquetas</w:t>
+            </w:r>
+            <w:r>
+              <w:rPr>
+                <w:noProof/>
+                <w:webHidden/>
+              </w:rPr>
+              <w:tab/>
+            </w:r>
+            <w:r>
+              <w:rPr>
+                <w:noProof/>
+                <w:webHidden/>
+              </w:rPr>
+              <w:fldChar w:fldCharType="begin"/>
+            </w:r>
+            <w:r>
+              <w:rPr>
+                <w:noProof/>
+                <w:webHidden/>
+              </w:rPr>
+              <w:instrText xml:space="preserve"> PAGEREF _Toc242960873 \h </w:instrText>
+            </w:r>
+            <w:r>
+              <w:rPr>
+                <w:noProof/>
+                <w:webHidden/>
+              </w:rPr>
+            </w:r>
+            <w:r>
+              <w:rPr>
+                <w:noProof/>
+                <w:webHidden/>
+              </w:rPr>
+              <w:fldChar w:fldCharType="separate"/>
+            </w:r>
+            <w:r>
+              <w:rPr>
+                <w:noProof/>
+                <w:webHidden/>
+              </w:rPr>
+              <w:t>13</w:t>
+            </w:r>
+            <w:r>
+              <w:rPr>
+                <w:noProof/>
+                <w:webHidden/>
+              </w:rPr>
+              <w:fldChar w:fldCharType="end"/>
+            </w:r>
+          </w:hyperlink>
+        </w:p>
+        <w:p>
+          <w:pPr>
+            <w:pStyle w:val="TDC2"/>
+            <w:tabs>
+              <w:tab w:val="right" w:leader="dot" w:pos="9629"/>
+            </w:tabs>
+            <w:rPr>
+              <w:noProof/>
+            </w:rPr>
+          </w:pPr>
+          <w:hyperlink w:anchor="_Toc242960874" w:history="1">
+            <w:r>
+              <w:rPr>
+                <w:rStyle w:val="Hipervnculo"/>
+                <w:noProof/>
+              </w:rPr>
+              <w:t>Regularización de las pesadas</w:t>
+            </w:r>
+            <w:r>
+              <w:rPr>
+                <w:noProof/>
+                <w:webHidden/>
+              </w:rPr>
+              <w:tab/>
+            </w:r>
+            <w:r>
+              <w:rPr>
+                <w:noProof/>
+                <w:webHidden/>
+              </w:rPr>
+              <w:fldChar w:fldCharType="begin"/>
+            </w:r>
+            <w:r>
+              <w:rPr>
+                <w:noProof/>
+                <w:webHidden/>
+              </w:rPr>
+              <w:instrText xml:space="preserve"> PAGEREF _Toc242960874 \h </w:instrText>
+            </w:r>
+            <w:r>
+              <w:rPr>
+                <w:noProof/>
+                <w:webHidden/>
+              </w:rPr>
+            </w:r>
+            <w:r>
+              <w:rPr>
+                <w:noProof/>
+                <w:webHidden/>
+              </w:rPr>
+              <w:fldChar w:fldCharType="separate"/>
+            </w:r>
+            <w:r>
+              <w:rPr>
+                <w:noProof/>
+                <w:webHidden/>
+              </w:rPr>
+              <w:t>13</w:t>
+            </w:r>
+            <w:r>
+              <w:rPr>
+                <w:noProof/>
+                <w:webHidden/>
+              </w:rPr>
+              <w:fldChar w:fldCharType="end"/>
+            </w:r>
+          </w:hyperlink>
+        </w:p>
+        <w:p>
+          <w:pPr>
+            <w:pStyle w:val="TDC2"/>
+            <w:tabs>
+              <w:tab w:val="right" w:leader="dot" w:pos="9629"/>
+            </w:tabs>
+            <w:rPr>
+              <w:noProof/>
+            </w:rPr>
+          </w:pPr>
+          <w:hyperlink w:anchor="_Toc242960875" w:history="1">
+            <w:r>
+              <w:rPr>
+                <w:rStyle w:val="Hipervnculo"/>
+                <w:noProof/>
+              </w:rPr>
+              <w:t>Eliminación de líneas de la regularización.</w:t>
+            </w:r>
+            <w:r>
+              <w:rPr>
+                <w:noProof/>
+                <w:webHidden/>
+              </w:rPr>
+              <w:tab/>
+            </w:r>
+            <w:r>
+              <w:rPr>
+                <w:noProof/>
+                <w:webHidden/>
+              </w:rPr>
+              <w:fldChar w:fldCharType="begin"/>
+            </w:r>
+            <w:r>
+              <w:rPr>
+                <w:noProof/>
+                <w:webHidden/>
+              </w:rPr>
+              <w:instrText xml:space="preserve"> PAGEREF _Toc242960875 \h </w:instrText>
+            </w:r>
+            <w:r>
+              <w:rPr>
+                <w:noProof/>
+                <w:webHidden/>
+              </w:rPr>
+            </w:r>
+            <w:r>
+              <w:rPr>
+                <w:noProof/>
+                <w:webHidden/>
+              </w:rPr>
+              <w:fldChar w:fldCharType="separate"/>
+            </w:r>
+            <w:r>
+              <w:rPr>
+                <w:noProof/>
+                <w:webHidden/>
+              </w:rPr>
+              <w:t>14</w:t>
+            </w:r>
+            <w:r>
+              <w:rPr>
+                <w:noProof/>
+                <w:webHidden/>
+              </w:rPr>
+              <w:fldChar w:fldCharType="end"/>
+            </w:r>
+          </w:hyperlink>
+        </w:p>
+        <w:p>
+          <w:pPr>
+            <w:pStyle w:val="TDC2"/>
+            <w:tabs>
+              <w:tab w:val="right" w:leader="dot" w:pos="9629"/>
+            </w:tabs>
+            <w:rPr>
+              <w:noProof/>
+            </w:rPr>
+          </w:pPr>
+          <w:hyperlink w:anchor="_Toc242960876" w:history="1">
+            <w:r>
+              <w:rPr>
+                <w:rStyle w:val="Hipervnculo"/>
+                <w:noProof/>
+              </w:rPr>
+              <w:t>Modificación de la etiqueta de una pesada</w:t>
+            </w:r>
+            <w:r>
+              <w:rPr>
+                <w:noProof/>
+                <w:webHidden/>
+              </w:rPr>
+              <w:tab/>
+            </w:r>
+            <w:r>
+              <w:rPr>
+                <w:noProof/>
+                <w:webHidden/>
+              </w:rPr>
+              <w:fldChar w:fldCharType="begin"/>
+            </w:r>
+            <w:r>
+              <w:rPr>
+                <w:noProof/>
+                <w:webHidden/>
+              </w:rPr>
+              <w:instrText xml:space="preserve"> PAGEREF _Toc242960876 \h </w:instrText>
+            </w:r>
+            <w:r>
+              <w:rPr>
+                <w:noProof/>
+                <w:webHidden/>
+              </w:rPr>
+            </w:r>
+            <w:r>
+              <w:rPr>
+                <w:noProof/>
+                <w:webHidden/>
+              </w:rPr>
+              <w:fldChar w:fldCharType="separate"/>
+            </w:r>
+            <w:r>
+              <w:rPr>
+                <w:noProof/>
+                <w:webHidden/>
+              </w:rPr>
+              <w:t>14</w:t>
+            </w:r>
+            <w:r>
+              <w:rPr>
+                <w:noProof/>
+                <w:webHidden/>
+              </w:rPr>
+              <w:fldChar w:fldCharType="end"/>
+            </w:r>
+          </w:hyperlink>
+        </w:p>
+        <w:p>
+          <w:pPr>
+            <w:pStyle w:val="TDC2"/>
+            <w:tabs>
+              <w:tab w:val="right" w:leader="dot" w:pos="9629"/>
+            </w:tabs>
+            <w:rPr>
+              <w:noProof/>
+            </w:rPr>
+          </w:pPr>
+          <w:hyperlink w:anchor="_Toc242960877" w:history="1">
+            <w:r>
+              <w:rPr>
+                <w:rStyle w:val="Hipervnculo"/>
+                <w:noProof/>
+              </w:rPr>
+              <w:t>Diseño de etiquetas</w:t>
+            </w:r>
+            <w:r>
+              <w:rPr>
+                <w:noProof/>
+                <w:webHidden/>
+              </w:rPr>
+              <w:tab/>
+            </w:r>
+            <w:r>
+              <w:rPr>
+                <w:noProof/>
+                <w:webHidden/>
+              </w:rPr>
+              <w:fldChar w:fldCharType="begin"/>
+            </w:r>
+            <w:r>
+              <w:rPr>
+                <w:noProof/>
+                <w:webHidden/>
+              </w:rPr>
+              <w:instrText xml:space="preserve"> PAGEREF _Toc242960877 \h </w:instrText>
+            </w:r>
+            <w:r>
+              <w:rPr>
+                <w:noProof/>
+                <w:webHidden/>
+              </w:rPr>
+            </w:r>
+            <w:r>
+              <w:rPr>
+                <w:noProof/>
+                <w:webHidden/>
+              </w:rPr>
+              <w:fldChar w:fldCharType="separate"/>
+            </w:r>
+            <w:r>
+              <w:rPr>
+                <w:noProof/>
+                <w:webHidden/>
+              </w:rPr>
+              <w:t>14</w:t>
+            </w:r>
+            <w:r>
+              <w:rPr>
+                <w:noProof/>
+                <w:webHidden/>
+              </w:rPr>
+              <w:fldChar w:fldCharType="end"/>
+            </w:r>
+          </w:hyperlink>
+        </w:p>
+        <w:p>
+          <w:pPr>
+            <w:rPr>
+              <w:b/>
+              <w:bCs/>
+            </w:rPr>
+          </w:pPr>
+          <w:r>
+            <w:rPr>
+              <w:b/>
+              <w:bCs/>
+            </w:rPr>
+            <w:fldChar w:fldCharType="end"/>
+          </w:r>
+        </w:p>
+        <w:p>
+          <w:pPr>
+            <w:rPr>
+              <w:b/>
+              <w:bCs/>
+            </w:rPr>
+          </w:pPr>
+        </w:p>
+        <w:p>
+          <w:pPr>
+            <w:rPr>
+              <w:b/>
+              <w:bCs/>
+            </w:rPr>
+          </w:pPr>
+        </w:p>
+        <w:p/>
+      </w:sdtContent>
+    </w:sdt>
+    <w:p>
+      <w:bookmarkStart w:id="0" w:name="_Toc242960858"/>
+    </w:p>
     <w:p>
       <w:pPr>
         <w:pStyle w:val="Ttulo1"/>
       </w:pPr>
       <w:r>
+        <w:lastRenderedPageBreak/>
         <w:t>FUNCIONALIDAD DEL MÓDULO</w:t>
       </w:r>
+      <w:bookmarkEnd w:id="0"/>
     </w:p>
     <w:p/>
     <w:p>
@@ -60,9 +1496,11 @@
       <w:pPr>
         <w:pStyle w:val="Ttulo1"/>
       </w:pPr>
+      <w:bookmarkStart w:id="1" w:name="_Toc242960859"/>
       <w:r>
         <w:t>ARCHIVOS REQUERIDOS DEL MÓDULO</w:t>
       </w:r>
+      <w:bookmarkEnd w:id="1"/>
     </w:p>
     <w:p/>
     <w:p>
@@ -168,9 +1606,11 @@
       <w:pPr>
         <w:pStyle w:val="Ttulo1"/>
       </w:pPr>
+      <w:bookmarkStart w:id="2" w:name="_Toc242960860"/>
       <w:r>
         <w:t>CONFIGURACION</w:t>
       </w:r>
+      <w:bookmarkEnd w:id="2"/>
     </w:p>
     <w:p/>
     <w:p>
@@ -506,8 +1946,13 @@
           <w:p>
             <w:proofErr w:type="gramStart"/>
             <w:r>
-              <w:t>;Impresion</w:t>
-            </w:r>
+              <w:t>;</w:t>
+            </w:r>
+            <w:proofErr w:type="spellStart"/>
+            <w:r>
+              <w:t>Impresion</w:t>
+            </w:r>
+            <w:proofErr w:type="spellEnd"/>
             <w:proofErr w:type="gramEnd"/>
             <w:r>
               <w:t xml:space="preserve"> </w:t>
@@ -763,7 +2208,15 @@
       </w:r>
       <w:proofErr w:type="spellEnd"/>
       <w:r>
-        <w:t xml:space="preserve"> = Impresion </w:t>
+        <w:t xml:space="preserve"> = </w:t>
+      </w:r>
+      <w:proofErr w:type="spellStart"/>
+      <w:r>
+        <w:t>Impresion</w:t>
+      </w:r>
+      <w:proofErr w:type="spellEnd"/>
+      <w:r>
+        <w:t xml:space="preserve"> </w:t>
       </w:r>
       <w:proofErr w:type="spellStart"/>
       <w:r>
@@ -880,12 +2333,11 @@
       <w:pPr>
         <w:pStyle w:val="Ttulo1"/>
       </w:pPr>
-      <w:r>
-        <w:t>CONFIGURACION</w:t>
-      </w:r>
-      <w:r>
-        <w:t xml:space="preserve"> DE LA BÁSCULA</w:t>
-      </w:r>
+      <w:bookmarkStart w:id="3" w:name="_Toc242960861"/>
+      <w:r>
+        <w:t>CONFIGURACION DE LA BÁSCULA</w:t>
+      </w:r>
+      <w:bookmarkEnd w:id="3"/>
     </w:p>
     <w:p/>
     <w:p>
@@ -946,13 +2398,7 @@
       </w:r>
       <w:proofErr w:type="gramEnd"/>
       <w:r>
-        <w:t xml:space="preserve">. Pulsamos PRINT. Tiene que poner 8n1. </w:t>
-      </w:r>
-      <w:r>
-        <w:t>Si no, buscarlo con las flechas arriba y abajo. Pulsamos PRINT</w:t>
-      </w:r>
-      <w:r>
-        <w:t>.</w:t>
+        <w:t>. Pulsamos PRINT. Tiene que poner 8n1. Si no, buscarlo con las flechas arriba y abajo. Pulsamos PRINT.</w:t>
       </w:r>
     </w:p>
     <w:p>
@@ -964,16 +2410,7 @@
         </w:numPr>
       </w:pPr>
       <w:r>
-        <w:t xml:space="preserve">Aparece BAUD. </w:t>
-      </w:r>
-      <w:r>
-        <w:t xml:space="preserve"> Pulsamos PRINT</w:t>
-      </w:r>
-      <w:r>
-        <w:t xml:space="preserve">. Tiene que poner 9600. </w:t>
-      </w:r>
-      <w:r>
-        <w:t xml:space="preserve"> Si no, buscarlo con las flechas arriba y abajo. Pulsamos PRINT.</w:t>
+        <w:t>Aparece BAUD.  Pulsamos PRINT. Tiene que poner 9600.  Si no, buscarlo con las flechas arriba y abajo. Pulsamos PRINT.</w:t>
       </w:r>
     </w:p>
     <w:p>
@@ -985,16 +2422,7 @@
         </w:numPr>
       </w:pPr>
       <w:r>
-        <w:t xml:space="preserve">Aparece PROTOCOL. </w:t>
-      </w:r>
-      <w:r>
-        <w:t>Pulsamos PRINT</w:t>
-      </w:r>
-      <w:r>
-        <w:t xml:space="preserve">. Tiene que poner EPSA. </w:t>
-      </w:r>
-      <w:r>
-        <w:t>Si no, buscarlo con las flechas arriba y abajo. Pulsamos PRINT.</w:t>
+        <w:t>Aparece PROTOCOL. Pulsamos PRINT. Tiene que poner EPSA. Si no, buscarlo con las flechas arriba y abajo. Pulsamos PRINT.</w:t>
       </w:r>
     </w:p>
     <w:p>
@@ -1006,16 +2434,7 @@
         </w:numPr>
       </w:pPr>
       <w:r>
-        <w:t xml:space="preserve">Aparece DIRECC. </w:t>
-      </w:r>
-      <w:r>
-        <w:t>Pulsamos PRINT. Tiene que poner</w:t>
-      </w:r>
-      <w:r>
-        <w:t xml:space="preserve"> Add 00</w:t>
-      </w:r>
-      <w:r>
-        <w:t>. Pulsamos PRINT.</w:t>
+        <w:t>Aparece DIRECC. Pulsamos PRINT. Tiene que poner Add 00. Pulsamos PRINT.</w:t>
       </w:r>
     </w:p>
     <w:p>
@@ -1035,13 +2454,7 @@
       </w:r>
       <w:proofErr w:type="spellEnd"/>
       <w:r>
-        <w:t xml:space="preserve">.  </w:t>
-      </w:r>
-      <w:r>
-        <w:t>Pulsamos PRINT</w:t>
-      </w:r>
-      <w:r>
-        <w:t>. Tiene que poner PCPEt1.</w:t>
+        <w:t>.  Pulsamos PRINT. Tiene que poner PCPEt1.</w:t>
       </w:r>
       <w:r>
         <w:t xml:space="preserve"> </w:t>
@@ -1131,19 +2544,23 @@
       <w:pPr>
         <w:pStyle w:val="Ttulo1"/>
       </w:pPr>
+      <w:bookmarkStart w:id="4" w:name="_Toc242960862"/>
       <w:r>
         <w:lastRenderedPageBreak/>
         <w:t>FUNCIONAMIENTO DE LA APLICACIÓN</w:t>
       </w:r>
+      <w:bookmarkEnd w:id="4"/>
     </w:p>
     <w:p/>
     <w:p>
       <w:pPr>
         <w:pStyle w:val="Ttulo2"/>
       </w:pPr>
+      <w:bookmarkStart w:id="5" w:name="_Toc242960863"/>
       <w:r>
         <w:t>Trabajo en A3erp</w:t>
       </w:r>
+      <w:bookmarkEnd w:id="5"/>
     </w:p>
     <w:p/>
     <w:p>
@@ -1268,9 +2685,11 @@
       <w:pPr>
         <w:pStyle w:val="Ttulo2"/>
       </w:pPr>
+      <w:bookmarkStart w:id="6" w:name="_Toc242960864"/>
       <w:r>
         <w:t>Alta de los usuarios del módulo</w:t>
       </w:r>
+      <w:bookmarkEnd w:id="6"/>
     </w:p>
     <w:p/>
     <w:p>
@@ -1336,9 +2755,11 @@
       <w:pPr>
         <w:pStyle w:val="Ttulo2"/>
       </w:pPr>
+      <w:bookmarkStart w:id="7" w:name="_Toc242960865"/>
       <w:r>
         <w:t>Alta de basculas</w:t>
       </w:r>
+      <w:bookmarkEnd w:id="7"/>
     </w:p>
     <w:p/>
     <w:p>
@@ -1392,9 +2813,11 @@
       <w:pPr>
         <w:pStyle w:val="Ttulo2"/>
       </w:pPr>
+      <w:bookmarkStart w:id="8" w:name="_Toc242960866"/>
       <w:r>
         <w:t>Alta de tipos de articulo</w:t>
       </w:r>
+      <w:bookmarkEnd w:id="8"/>
     </w:p>
     <w:p>
       <w:r>
@@ -1455,10 +2878,12 @@
       <w:pPr>
         <w:pStyle w:val="Ttulo2"/>
       </w:pPr>
+      <w:bookmarkStart w:id="9" w:name="_Toc242960867"/>
       <w:r>
         <w:lastRenderedPageBreak/>
         <w:t>Configuración de etiquetas</w:t>
       </w:r>
+      <w:bookmarkEnd w:id="9"/>
     </w:p>
     <w:p>
       <w:r>
@@ -1736,9 +3161,11 @@
         <w:pStyle w:val="Ttulo2"/>
         <w:ind w:left="708" w:hanging="708"/>
       </w:pPr>
+      <w:bookmarkStart w:id="10" w:name="_Toc242960868"/>
       <w:r>
         <w:t>Datos de los artículos para las etiquetas</w:t>
       </w:r>
+      <w:bookmarkEnd w:id="10"/>
     </w:p>
     <w:p>
       <w:proofErr w:type="gramStart"/>
@@ -1784,9 +3211,11 @@
       <w:pPr>
         <w:pStyle w:val="Ttulo2"/>
       </w:pPr>
+      <w:bookmarkStart w:id="11" w:name="_Toc242960869"/>
       <w:r>
         <w:t>Trabajo en el módulo</w:t>
       </w:r>
+      <w:bookmarkEnd w:id="11"/>
     </w:p>
     <w:p/>
     <w:p>
@@ -1849,6 +3278,9 @@
     </w:p>
     <w:p>
       <w:r>
+        <w:rPr>
+          <w:noProof/>
+        </w:rPr>
         <w:drawing>
           <wp:inline distT="0" distB="0" distL="0" distR="0" wp14:anchorId="108BB3FD" wp14:editId="0BC68D5F">
             <wp:extent cx="6120765" cy="5774690"/>
@@ -2284,8 +3716,119 @@
         <w:pStyle w:val="Ttulo2"/>
       </w:pPr>
       <w:r>
+        <w:t>Artículos distribuidos</w:t>
+      </w:r>
+    </w:p>
+    <w:p>
+      <w:r>
+        <w:t>Consideramos artículos distribuidos a aquellos que no tienen realmente una fabricación, si no, una transformación.</w:t>
+      </w:r>
+    </w:p>
+    <w:p>
+      <w:r>
+        <w:t xml:space="preserve">Para diferenciar los articulo distribuidos, consideraremos articulo distribuido a aquel cuya etiqueta sea la etiqueta distribuida, identificando esta por el código de etiqueta indicado en la configuración en el parámetro </w:t>
+      </w:r>
+      <w:proofErr w:type="spellStart"/>
+      <w:r>
+        <w:rPr>
+          <w:b/>
+          <w:bCs/>
+        </w:rPr>
+        <w:t>EtiDist</w:t>
+      </w:r>
+      <w:proofErr w:type="spellEnd"/>
+      <w:r>
+        <w:t>.</w:t>
+      </w:r>
+    </w:p>
+    <w:p>
+      <w:r>
+        <w:t>El funcionamiento es un poco distinto al del resto de artículos.</w:t>
+      </w:r>
+    </w:p>
+    <w:p>
+      <w:pPr>
+        <w:pStyle w:val="Ttulo2"/>
+      </w:pPr>
+      <w:r>
+        <w:t>Inserción de lotes</w:t>
+      </w:r>
+    </w:p>
+    <w:p>
+      <w:pPr>
+        <w:pStyle w:val="Ttulo3"/>
+      </w:pPr>
+      <w:r>
+        <w:t>Artículos no distribuidos</w:t>
+      </w:r>
+    </w:p>
+    <w:p>
+      <w:r>
+        <w:t>En los artículos no distribuidos, podemos insertar el lote de forma manual o pulsando F12, que nos llevará a la búsqueda de los lotes disponibles para ese artículo.</w:t>
+      </w:r>
+    </w:p>
+    <w:p>
+      <w:r>
+        <w:t xml:space="preserve">A la hora de buscar los lotes, primero debe estar seleccionado un artículo. </w:t>
+      </w:r>
+    </w:p>
+    <w:p>
+      <w:r>
+        <w:t>En función de la familia del artículo, se buscará el tipo de artículo que es y se tomará el código.</w:t>
+      </w:r>
+    </w:p>
+    <w:p>
+      <w:r>
+        <w:t>Buscará los lotes que comiencen por ese código de tipo en el parametrizable 3 de las regularizaciones que no estén cerradas y esos serán los lotes que muestre como disponibles.</w:t>
+      </w:r>
+    </w:p>
+    <w:p>
+      <w:r>
+        <w:t xml:space="preserve">No se podrá seleccionar un lote que no esté </w:t>
+      </w:r>
+      <w:r>
+        <w:t>en</w:t>
+      </w:r>
+      <w:r>
+        <w:t xml:space="preserve"> ninguna </w:t>
+      </w:r>
+      <w:r>
+        <w:t>regularización.</w:t>
+      </w:r>
+    </w:p>
+    <w:p>
+      <w:pPr>
+        <w:pStyle w:val="Ttulo3"/>
+      </w:pPr>
+      <w:r>
+        <w:t>Artículos distribuidos</w:t>
+      </w:r>
+    </w:p>
+    <w:p>
+      <w:r>
+        <w:t>En estos artículos, el lote siempre se pone manual, y tras ponerlo pide que seleccionemos el código del artículo original o padre.</w:t>
+      </w:r>
+    </w:p>
+    <w:p>
+      <w:r>
+        <w:lastRenderedPageBreak/>
+        <w:t>Una vez seleccionado el padre, buscará línea más reciente de los albaranes de compra que tengan ese lote para ese articulo padre y de ella tomará la FAO y el Arte de pesca.</w:t>
+      </w:r>
+    </w:p>
+    <w:p>
+      <w:r>
+        <w:t>Si no existe, no dejará poner el lote.</w:t>
+      </w:r>
+    </w:p>
+    <w:p>
+      <w:pPr>
+        <w:pStyle w:val="Ttulo2"/>
+      </w:pPr>
+      <w:bookmarkStart w:id="12" w:name="_Toc242960870"/>
+      <w:r>
         <w:t>Pesadas de producto</w:t>
       </w:r>
+      <w:bookmarkEnd w:id="12"/>
     </w:p>
     <w:p>
       <w:r>
@@ -2335,9 +3878,11 @@
       <w:pPr>
         <w:pStyle w:val="Ttulo2"/>
       </w:pPr>
+      <w:bookmarkStart w:id="13" w:name="_Toc242960871"/>
       <w:r>
         <w:t>Inserción manual de pesadas</w:t>
       </w:r>
+      <w:bookmarkEnd w:id="13"/>
     </w:p>
     <w:p>
       <w:r>
@@ -2346,6 +3891,9 @@
     </w:p>
     <w:p>
       <w:r>
+        <w:rPr>
+          <w:noProof/>
+        </w:rPr>
         <w:drawing>
           <wp:inline distT="0" distB="0" distL="0" distR="0" wp14:anchorId="4DAFD6EC" wp14:editId="6DD4EA68">
             <wp:extent cx="2372056" cy="685896"/>
@@ -2445,17 +3993,16 @@
       <w:pPr>
         <w:pStyle w:val="Ttulo2"/>
       </w:pPr>
+      <w:bookmarkStart w:id="14" w:name="_Toc242960872"/>
+      <w:r>
+        <w:t>Eliminación de pesadas</w:t>
+      </w:r>
+      <w:bookmarkEnd w:id="14"/>
+    </w:p>
+    <w:p/>
+    <w:p>
       <w:r>
         <w:lastRenderedPageBreak/>
-        <w:t>Eliminación</w:t>
-      </w:r>
-      <w:r>
-        <w:t xml:space="preserve"> de pesadas</w:t>
-      </w:r>
-    </w:p>
-    <w:p/>
-    <w:p>
-      <w:r>
         <w:t xml:space="preserve">Si por algún motivo queremos eliminar alguna de las pesadas realizadas, seleccionaremos la pesada y con el botón derecho del ratón seleccionaremos </w:t>
       </w:r>
       <w:r>
@@ -2474,9 +4021,11 @@
       <w:pPr>
         <w:pStyle w:val="Ttulo2"/>
       </w:pPr>
+      <w:bookmarkStart w:id="15" w:name="_Toc242960873"/>
       <w:r>
         <w:t>Impresión manual de etiquetas</w:t>
       </w:r>
+      <w:bookmarkEnd w:id="15"/>
     </w:p>
     <w:p>
       <w:pPr>
@@ -2505,11 +4054,20 @@
       <w:pPr>
         <w:pStyle w:val="Ttulo2"/>
       </w:pPr>
+      <w:bookmarkStart w:id="16" w:name="_Toc242960874"/>
       <w:r>
         <w:t>Regularización de las pesadas</w:t>
       </w:r>
-    </w:p>
-    <w:p/>
+      <w:bookmarkEnd w:id="16"/>
+    </w:p>
+    <w:p>
+      <w:pPr>
+        <w:pStyle w:val="Ttulo3"/>
+      </w:pPr>
+      <w:r>
+        <w:t>Artículos no distribuidos</w:t>
+      </w:r>
+    </w:p>
     <w:p>
       <w:pPr>
         <w:rPr>
@@ -2641,11 +4199,41 @@
     </w:p>
     <w:p>
       <w:pPr>
+        <w:pStyle w:val="Ttulo3"/>
+      </w:pPr>
+      <w:r>
+        <w:t>Artículos distribuidos</w:t>
+      </w:r>
+    </w:p>
+    <w:p>
+      <w:r>
+        <w:t>En los artículos distribuidos el funcionamiento es diferente.</w:t>
+      </w:r>
+    </w:p>
+    <w:p>
+      <w:r>
+        <w:t>No tenemos una regularización en la que trabajar, pues no son fabricaciones, sino transformaciones.</w:t>
+      </w:r>
+    </w:p>
+    <w:p>
+      <w:r>
+        <w:t>Si el artículo/os que estamos pesando son distribuidos, le hemos indicado el lote y el articulo padre.</w:t>
+      </w:r>
+    </w:p>
+    <w:p>
+      <w:r>
+        <w:t>Al pulsar a Regularizar, se creará una nueva regularización al almacén indicado en la configuración, con el articulo padre con la suma de todas las pesas en negativo y luego, como en el caso anterior, las pesadas realizadas agrupadas por artículo como líneas positivas.</w:t>
+      </w:r>
+    </w:p>
+    <w:p>
+      <w:pPr>
         <w:pStyle w:val="Ttulo2"/>
       </w:pPr>
+      <w:bookmarkStart w:id="17" w:name="_Toc242960875"/>
       <w:r>
         <w:t>Eliminación de líneas de la regularización.</w:t>
       </w:r>
+      <w:bookmarkEnd w:id="17"/>
     </w:p>
     <w:p>
       <w:r>
@@ -2716,9 +4304,12 @@
       <w:pPr>
         <w:pStyle w:val="Ttulo2"/>
       </w:pPr>
-      <w:r>
+      <w:bookmarkStart w:id="18" w:name="_Toc242960876"/>
+      <w:r>
+        <w:lastRenderedPageBreak/>
         <w:t>Modificación de la etiqueta de una pesada</w:t>
       </w:r>
+      <w:bookmarkEnd w:id="18"/>
     </w:p>
     <w:p/>
     <w:p>
@@ -2741,9 +4332,11 @@
       <w:pPr>
         <w:pStyle w:val="Ttulo2"/>
       </w:pPr>
+      <w:bookmarkStart w:id="19" w:name="_Toc242960877"/>
       <w:r>
         <w:t>Diseño de etiquetas</w:t>
       </w:r>
+      <w:bookmarkEnd w:id="19"/>
     </w:p>
     <w:p>
       <w:pPr>
@@ -2760,7 +4353,6 @@
         <w:rPr>
           <w:noProof/>
         </w:rPr>
-        <w:lastRenderedPageBreak/>
         <w:drawing>
           <wp:inline distT="0" distB="0" distL="0" distR="0" wp14:anchorId="74D5EA16" wp14:editId="4D8231DF">
             <wp:extent cx="624894" cy="541067"/>
@@ -2865,6 +4457,7 @@
     </w:p>
     <w:p>
       <w:r>
+        <w:lastRenderedPageBreak/>
         <w:t>Indicaremos un código para la etiqueta, la ruta completa de la etiqueta y el nombre que le damos a la etiqueta.</w:t>
       </w:r>
     </w:p>
@@ -3160,16 +4753,13 @@
       <w:t xml:space="preserve"> </w:t>
     </w:r>
     <w:r>
-      <w:t>28</w:t>
+      <w:t>15</w:t>
     </w:r>
     <w:r>
       <w:t>/</w:t>
     </w:r>
     <w:r>
-      <w:t>0</w:t>
-    </w:r>
-    <w:r>
-      <w:t>8</w:t>
+      <w:t>10</w:t>
     </w:r>
     <w:r>
       <w:t>/</w:t>
@@ -3348,7 +4938,28 @@
                               <w:sz w:val="24"/>
                               <w:szCs w:val="24"/>
                             </w:rPr>
-                            <w:t>. V.1.2.2</w:t>
+                            <w:t>. V.1.</w:t>
+                          </w:r>
+                          <w:r>
+                            <w:rPr>
+                              <w:sz w:val="24"/>
+                              <w:szCs w:val="24"/>
+                            </w:rPr>
+                            <w:t>3</w:t>
+                          </w:r>
+                          <w:r>
+                            <w:rPr>
+                              <w:sz w:val="24"/>
+                              <w:szCs w:val="24"/>
+                            </w:rPr>
+                            <w:t>.</w:t>
+                          </w:r>
+                          <w:r>
+                            <w:rPr>
+                              <w:sz w:val="24"/>
+                              <w:szCs w:val="24"/>
+                            </w:rPr>
+                            <w:t>1</w:t>
                           </w:r>
                         </w:p>
                       </w:txbxContent>
@@ -3401,7 +5012,28 @@
                         <w:sz w:val="24"/>
                         <w:szCs w:val="24"/>
                       </w:rPr>
-                      <w:t>. V.1.2.2</w:t>
+                      <w:t>. V.1.</w:t>
+                    </w:r>
+                    <w:r>
+                      <w:rPr>
+                        <w:sz w:val="24"/>
+                        <w:szCs w:val="24"/>
+                      </w:rPr>
+                      <w:t>3</w:t>
+                    </w:r>
+                    <w:r>
+                      <w:rPr>
+                        <w:sz w:val="24"/>
+                        <w:szCs w:val="24"/>
+                      </w:rPr>
+                      <w:t>.</w:t>
+                    </w:r>
+                    <w:r>
+                      <w:rPr>
+                        <w:sz w:val="24"/>
+                        <w:szCs w:val="24"/>
+                      </w:rPr>
+                      <w:t>1</w:t>
                     </w:r>
                   </w:p>
                 </w:txbxContent>
@@ -8327,6 +9959,28 @@
       <w:color w:val="365F91" w:themeColor="accent1" w:themeShade="BF"/>
     </w:rPr>
   </w:style>
+  <w:style w:type="paragraph" w:styleId="Ttulo3">
+    <w:name w:val="heading 3"/>
+    <w:basedOn w:val="Normal"/>
+    <w:next w:val="Normal"/>
+    <w:link w:val="Ttulo3Car"/>
+    <w:uiPriority w:val="9"/>
+    <w:unhideWhenUsed/>
+    <w:qFormat/>
+    <w:rsid w:val="004B51BB"/>
+    <w:pPr>
+      <w:keepNext/>
+      <w:keepLines/>
+      <w:spacing w:before="40" w:after="0"/>
+      <w:outlineLvl w:val="2"/>
+    </w:pPr>
+    <w:rPr>
+      <w:rFonts w:asciiTheme="majorHAnsi" w:eastAsiaTheme="majorEastAsia" w:hAnsiTheme="majorHAnsi" w:cstheme="majorBidi"/>
+      <w:color w:val="243F60" w:themeColor="accent1" w:themeShade="7F"/>
+      <w:sz w:val="24"/>
+      <w:szCs w:val="24"/>
+    </w:rPr>
+  </w:style>
   <w:style w:type="character" w:default="1" w:styleId="Fuentedeprrafopredeter">
     <w:name w:val="Default Paragraph Font"/>
     <w:uiPriority w:val="1"/>
@@ -8555,6 +10209,60 @@
       <w:i/>
       <w:iCs/>
       <w:color w:val="4F81BD" w:themeColor="accent1"/>
+    </w:rPr>
+  </w:style>
+  <w:style w:type="paragraph" w:styleId="TtuloTDC">
+    <w:name w:val="TOC Heading"/>
+    <w:basedOn w:val="Ttulo1"/>
+    <w:next w:val="Normal"/>
+    <w:uiPriority w:val="39"/>
+    <w:unhideWhenUsed/>
+    <w:qFormat/>
+    <w:rsid w:val="004B51BB"/>
+    <w:pPr>
+      <w:shd w:val="clear" w:color="auto" w:fill="auto"/>
+      <w:outlineLvl w:val="9"/>
+    </w:pPr>
+    <w:rPr>
+      <w:lang w:eastAsia="es-ES"/>
+    </w:rPr>
+  </w:style>
+  <w:style w:type="paragraph" w:styleId="TDC1">
+    <w:name w:val="toc 1"/>
+    <w:basedOn w:val="Normal"/>
+    <w:next w:val="Normal"/>
+    <w:autoRedefine/>
+    <w:uiPriority w:val="39"/>
+    <w:unhideWhenUsed/>
+    <w:rsid w:val="004B51BB"/>
+    <w:pPr>
+      <w:spacing w:after="100"/>
+    </w:pPr>
+  </w:style>
+  <w:style w:type="paragraph" w:styleId="TDC2">
+    <w:name w:val="toc 2"/>
+    <w:basedOn w:val="Normal"/>
+    <w:next w:val="Normal"/>
+    <w:autoRedefine/>
+    <w:uiPriority w:val="39"/>
+    <w:unhideWhenUsed/>
+    <w:rsid w:val="004B51BB"/>
+    <w:pPr>
+      <w:spacing w:after="100"/>
+      <w:ind w:left="280"/>
+    </w:pPr>
+  </w:style>
+  <w:style w:type="character" w:customStyle="1" w:styleId="Ttulo3Car">
+    <w:name w:val="Título 3 Car"/>
+    <w:basedOn w:val="Fuentedeprrafopredeter"/>
+    <w:link w:val="Ttulo3"/>
+    <w:uiPriority w:val="9"/>
+    <w:rsid w:val="004B51BB"/>
+    <w:rPr>
+      <w:rFonts w:asciiTheme="majorHAnsi" w:eastAsiaTheme="majorEastAsia" w:hAnsiTheme="majorHAnsi" w:cstheme="majorBidi"/>
+      <w:color w:val="243F60" w:themeColor="accent1" w:themeShade="7F"/>
+      <w:sz w:val="24"/>
+      <w:szCs w:val="24"/>
     </w:rPr>
   </w:style>
 </w:styles>

</xml_diff>